<commit_message>
Compressed blank lines out; no substantive change
</commit_message>
<xml_diff>
--- a/Half_Roof/Half_Roof.docx
+++ b/Half_Roof/Half_Roof.docx
@@ -188,7 +188,7 @@
               </w:rPr>
               <w:lastRenderedPageBreak/>
               <w:drawing>
-                <wp:inline distT="0" distB="0" distL="0" distR="0" wp14:anchorId="17C94757" wp14:editId="1FC2816A">
+                <wp:inline distT="0" distB="0" distL="0" distR="0" wp14:anchorId="2966B6EC" wp14:editId="6484489C">
                   <wp:extent cx="5943600" cy="8229600"/>
                   <wp:effectExtent l="0" t="0" r="0" b="0"/>
                   <wp:docPr id="21" name="Picture" descr=" "/>
@@ -365,7 +365,7 @@
               </w:rPr>
               <w:lastRenderedPageBreak/>
               <w:drawing>
-                <wp:inline distT="0" distB="0" distL="0" distR="0" wp14:anchorId="03EB8AD1" wp14:editId="7E391617">
+                <wp:inline distT="0" distB="0" distL="0" distR="0" wp14:anchorId="41E27073" wp14:editId="2700B535">
                   <wp:extent cx="5943600" cy="8229600"/>
                   <wp:effectExtent l="0" t="0" r="0" b="0"/>
                   <wp:docPr id="27" name="Picture" descr=" "/>
@@ -512,7 +512,7 @@
               </w:rPr>
               <w:lastRenderedPageBreak/>
               <w:drawing>
-                <wp:inline distT="0" distB="0" distL="0" distR="0" wp14:anchorId="6F1169F6" wp14:editId="0A1AFB15">
+                <wp:inline distT="0" distB="0" distL="0" distR="0" wp14:anchorId="61348C64" wp14:editId="37FAC5E0">
                   <wp:extent cx="5943600" cy="8229600"/>
                   <wp:effectExtent l="0" t="0" r="0" b="0"/>
                   <wp:docPr id="33" name="Picture" descr=" "/>
@@ -721,7 +721,7 @@
               </w:rPr>
               <w:lastRenderedPageBreak/>
               <w:drawing>
-                <wp:inline distT="0" distB="0" distL="0" distR="0" wp14:anchorId="481EF9B8" wp14:editId="05F3A789">
+                <wp:inline distT="0" distB="0" distL="0" distR="0" wp14:anchorId="2A85EB48" wp14:editId="6E9FF8E1">
                   <wp:extent cx="5943600" cy="8229600"/>
                   <wp:effectExtent l="0" t="0" r="0" b="0"/>
                   <wp:docPr id="39" name="Picture" descr=" "/>
@@ -861,7 +861,7 @@
               </w:rPr>
               <w:lastRenderedPageBreak/>
               <w:drawing>
-                <wp:inline distT="0" distB="0" distL="0" distR="0" wp14:anchorId="3D836E11" wp14:editId="76225531">
+                <wp:inline distT="0" distB="0" distL="0" distR="0" wp14:anchorId="0A1BB3C5" wp14:editId="63CC52EC">
                   <wp:extent cx="5943600" cy="8229600"/>
                   <wp:effectExtent l="0" t="0" r="0" b="0"/>
                   <wp:docPr id="45" name="Picture" descr=" "/>
@@ -971,7 +971,7 @@
               </w:rPr>
               <w:lastRenderedPageBreak/>
               <w:drawing>
-                <wp:inline distT="0" distB="0" distL="0" distR="0" wp14:anchorId="1E2B42E5" wp14:editId="7CB21C09">
+                <wp:inline distT="0" distB="0" distL="0" distR="0" wp14:anchorId="30961714" wp14:editId="090030F6">
                   <wp:extent cx="5943600" cy="8229600"/>
                   <wp:effectExtent l="0" t="0" r="0" b="0"/>
                   <wp:docPr id="51" name="Picture" descr=" "/>
@@ -1127,7 +1127,7 @@
               </w:rPr>
               <w:lastRenderedPageBreak/>
               <w:drawing>
-                <wp:inline distT="0" distB="0" distL="0" distR="0" wp14:anchorId="57EA8519" wp14:editId="5B00E56D">
+                <wp:inline distT="0" distB="0" distL="0" distR="0" wp14:anchorId="676306E9" wp14:editId="5D0D05AA">
                   <wp:extent cx="5943600" cy="8229600"/>
                   <wp:effectExtent l="0" t="0" r="0" b="0"/>
                   <wp:docPr id="57" name="Picture" descr=" "/>
@@ -1624,7 +1624,7 @@
   <w:abstractNum w:abstractNumId="0" w15:restartNumberingAfterBreak="0">
     <w:nsid w:val="0000A990"/>
     <w:multiLevelType w:val="multilevel"/>
-    <w:tmpl w:val="737CC0BC"/>
+    <w:tmpl w:val="AA46BF46"/>
     <w:lvl w:ilvl="0">
       <w:numFmt w:val="bullet"/>
       <w:lvlText w:val=" "/>
@@ -1701,7 +1701,7 @@
   <w:abstractNum w:abstractNumId="1" w15:restartNumberingAfterBreak="0">
     <w:nsid w:val="0000A991"/>
     <w:multiLevelType w:val="multilevel"/>
-    <w:tmpl w:val="CE46C782"/>
+    <w:tmpl w:val="B11873DC"/>
     <w:lvl w:ilvl="0">
       <w:numFmt w:val="bullet"/>
       <w:lvlText w:val=""/>
@@ -1805,7 +1805,7 @@
   <w:abstractNum w:abstractNumId="2" w15:restartNumberingAfterBreak="0">
     <w:nsid w:val="00A99411"/>
     <w:multiLevelType w:val="multilevel"/>
-    <w:tmpl w:val="993E75C4"/>
+    <w:tmpl w:val="B5F6269E"/>
     <w:lvl w:ilvl="0">
       <w:start w:val="1"/>
       <w:numFmt w:val="decimal"/>
@@ -2004,37 +2004,37 @@
   <w:num w:numId="1" w16cid:durableId="1603538387">
     <w:abstractNumId w:val="3"/>
   </w:num>
-  <w:num w:numId="2" w16cid:durableId="998508375">
+  <w:num w:numId="2" w16cid:durableId="886451967">
     <w:abstractNumId w:val="0"/>
   </w:num>
-  <w:num w:numId="3" w16cid:durableId="1600673053">
+  <w:num w:numId="3" w16cid:durableId="1993411228">
     <w:abstractNumId w:val="1"/>
   </w:num>
-  <w:num w:numId="4" w16cid:durableId="1584143225">
+  <w:num w:numId="4" w16cid:durableId="442572898">
     <w:abstractNumId w:val="1"/>
   </w:num>
-  <w:num w:numId="5" w16cid:durableId="2130859330">
+  <w:num w:numId="5" w16cid:durableId="1587838711">
     <w:abstractNumId w:val="1"/>
   </w:num>
-  <w:num w:numId="6" w16cid:durableId="1989892805">
+  <w:num w:numId="6" w16cid:durableId="1071846932">
     <w:abstractNumId w:val="1"/>
   </w:num>
-  <w:num w:numId="7" w16cid:durableId="922186229">
+  <w:num w:numId="7" w16cid:durableId="1077633339">
     <w:abstractNumId w:val="1"/>
   </w:num>
-  <w:num w:numId="8" w16cid:durableId="1248271746">
+  <w:num w:numId="8" w16cid:durableId="340934515">
     <w:abstractNumId w:val="1"/>
   </w:num>
-  <w:num w:numId="9" w16cid:durableId="1043136527">
+  <w:num w:numId="9" w16cid:durableId="1637835061">
     <w:abstractNumId w:val="1"/>
   </w:num>
-  <w:num w:numId="10" w16cid:durableId="1730111941">
+  <w:num w:numId="10" w16cid:durableId="1810438539">
     <w:abstractNumId w:val="1"/>
   </w:num>
-  <w:num w:numId="11" w16cid:durableId="1434667350">
+  <w:num w:numId="11" w16cid:durableId="195460829">
     <w:abstractNumId w:val="1"/>
   </w:num>
-  <w:num w:numId="12" w16cid:durableId="1296370904">
+  <w:num w:numId="12" w16cid:durableId="574635026">
     <w:abstractNumId w:val="2"/>
     <w:lvlOverride w:ilvl="0">
       <w:startOverride w:val="1"/>

</xml_diff>

<commit_message>
Formatting and clarification only.
</commit_message>
<xml_diff>
--- a/Half_Roof/Half_Roof.docx
+++ b/Half_Roof/Half_Roof.docx
@@ -2,7 +2,7 @@
 <file path=word/document.xml><?xml version="1.0" encoding="utf-8"?>
 <w:document xmlns:w="http://schemas.openxmlformats.org/wordprocessingml/2006/main" xmlns:m="http://schemas.openxmlformats.org/officeDocument/2006/math" xmlns:r="http://schemas.openxmlformats.org/officeDocument/2006/relationships" xmlns:o="urn:schemas-microsoft-com:office:office" xmlns:v="urn:schemas-microsoft-com:vml" xmlns:w10="urn:schemas-microsoft-com:office:word" xmlns:a="http://schemas.openxmlformats.org/drawingml/2006/main" xmlns:pic="http://schemas.openxmlformats.org/drawingml/2006/picture" xmlns:wp="http://schemas.openxmlformats.org/drawingml/2006/wordprocessingDrawing">
   <w:body>
-    <w:bookmarkStart w:id="63" w:name="half-roof---set-up-list"/>
+    <w:bookmarkStart w:id="49" w:name="half-roof---set-up-list"/>
     <w:p>
       <w:pPr>
         <w:pStyle w:val="Heading1"/>
@@ -124,7 +124,7 @@
         <w:br w:type="page"/>
       </w:r>
     </w:p>
-    <w:bookmarkStart w:id="25" w:name="step-1"/>
+    <w:bookmarkStart w:id="23" w:name="step-1"/>
     <w:p>
       <w:pPr>
         <w:pStyle w:val="Heading2"/>
@@ -162,89 +162,55 @@
         <w:br w:type="page"/>
       </w:r>
     </w:p>
-    <w:tbl>
-      <w:tblPr>
-        <w:tblStyle w:val="Table"/>
-        <w:tblW w:type="pct" w:w="5000"/>
-        <w:tblLayout w:type="fixed"/>
-        <w:tblLook w:firstRow="0" w:lastRow="0" w:firstColumn="0" w:lastColumn="0" w:noHBand="0" w:noVBand="0" w:val="0000"/>
-      </w:tblPr>
-      <w:tblGrid>
-        <w:gridCol w:w="7920"/>
-      </w:tblGrid>
-      <w:tr>
-        <w:tc>
-          <w:tcPr/>
-          <w:bookmarkStart w:id="24" w:name="fig-539a35d47e664c97a50115a146a7f1bd-1"/>
-          <w:p>
-            <w:pPr>
-              <w:pStyle w:val="Compact"/>
-              <w:jc w:val="center"/>
-            </w:pPr>
-            <w:bookmarkStart w:id="23" w:name="fig-539a35d47e664c97a50115a146a7f1bd-1"/>
-            <w:r>
-              <w:drawing>
-                <wp:inline>
-                  <wp:extent cx="5943600" cy="8229600"/>
-                  <wp:effectExtent b="0" l="0" r="0" t="0"/>
-                  <wp:docPr descr=" " title="" id="21" name="Picture"/>
-                  <a:graphic>
-                    <a:graphicData uri="http://schemas.openxmlformats.org/drawingml/2006/picture">
-                      <pic:pic>
-                        <pic:nvPicPr>
-                          <pic:cNvPr descr="images/half_roof_01.png" id="22" name="Picture"/>
-                          <pic:cNvPicPr>
-                            <a:picLocks noChangeArrowheads="1" noChangeAspect="1"/>
-                          </pic:cNvPicPr>
-                        </pic:nvPicPr>
-                        <pic:blipFill>
-                          <a:blip r:embed="rId20"/>
-                          <a:stretch>
-                            <a:fillRect/>
-                          </a:stretch>
-                        </pic:blipFill>
-                        <pic:spPr bwMode="auto">
-                          <a:xfrm>
-                            <a:off x="0" y="0"/>
-                            <a:ext cx="5943600" cy="8229600"/>
-                          </a:xfrm>
-                          <a:prstGeom prst="rect">
-                            <a:avLst/>
-                          </a:prstGeom>
-                          <a:noFill/>
-                          <a:ln w="9525">
-                            <a:noFill/>
-                            <a:headEnd/>
-                            <a:tailEnd/>
-                          </a:ln>
-                        </pic:spPr>
-                      </pic:pic>
-                    </a:graphicData>
-                  </a:graphic>
-                </wp:inline>
-              </w:drawing>
-            </w:r>
-            <w:bookmarkEnd w:id="23"/>
-          </w:p>
-          <w:p>
-            <w:pPr>
-              <w:jc w:val="center"/>
-            </w:pPr>
-            <w:pPr>
-              <w:jc w:val="start"/>
-              <w:spacing w:before="200"/>
-              <w:pStyle w:val="ImageCaption"/>
-            </w:pPr>
-            <w:r>
-              <w:t xml:space="preserve"> </w:t>
-            </w:r>
-          </w:p>
-          <w:bookmarkEnd w:id="24"/>
-        </w:tc>
-      </w:tr>
-    </w:tbl>
-    <w:bookmarkEnd w:id="25"/>
-    <w:bookmarkStart w:id="31" w:name="step-2"/>
+    <w:p>
+      <w:pPr>
+        <w:pStyle w:val="FirstParagraph"/>
+      </w:pPr>
+      <w:r>
+        <w:drawing>
+          <wp:inline>
+            <wp:extent cx="5943600" cy="8229600"/>
+            <wp:effectExtent b="0" l="0" r="0" t="0"/>
+            <wp:docPr descr="" title="" id="21" name="Picture"/>
+            <a:graphic>
+              <a:graphicData uri="http://schemas.openxmlformats.org/drawingml/2006/picture">
+                <pic:pic>
+                  <pic:nvPicPr>
+                    <pic:cNvPr descr="images/half_roof_01.png" id="22" name="Picture"/>
+                    <pic:cNvPicPr>
+                      <a:picLocks noChangeArrowheads="1" noChangeAspect="1"/>
+                    </pic:cNvPicPr>
+                  </pic:nvPicPr>
+                  <pic:blipFill>
+                    <a:blip r:embed="rId20"/>
+                    <a:stretch>
+                      <a:fillRect/>
+                    </a:stretch>
+                  </pic:blipFill>
+                  <pic:spPr bwMode="auto">
+                    <a:xfrm>
+                      <a:off x="0" y="0"/>
+                      <a:ext cx="5943600" cy="8229600"/>
+                    </a:xfrm>
+                    <a:prstGeom prst="rect">
+                      <a:avLst/>
+                    </a:prstGeom>
+                    <a:noFill/>
+                    <a:ln w="9525">
+                      <a:noFill/>
+                      <a:headEnd/>
+                      <a:tailEnd/>
+                    </a:ln>
+                  </pic:spPr>
+                </pic:pic>
+              </a:graphicData>
+            </a:graphic>
+          </wp:inline>
+        </w:drawing>
+      </w:r>
+    </w:p>
+    <w:bookmarkEnd w:id="23"/>
+    <w:bookmarkStart w:id="27" w:name="step-2"/>
     <w:p>
       <w:pPr>
         <w:pStyle w:val="Heading2"/>
@@ -357,245 +323,177 @@
         <w:br w:type="page"/>
       </w:r>
     </w:p>
-    <w:tbl>
-      <w:tblPr>
-        <w:tblStyle w:val="Table"/>
-        <w:tblW w:type="pct" w:w="5000"/>
-        <w:tblLayout w:type="fixed"/>
-        <w:tblLook w:firstRow="0" w:lastRow="0" w:firstColumn="0" w:lastColumn="0" w:noHBand="0" w:noVBand="0" w:val="0000"/>
-      </w:tblPr>
-      <w:tblGrid>
-        <w:gridCol w:w="7920"/>
-      </w:tblGrid>
-      <w:tr>
-        <w:tc>
-          <w:tcPr/>
-          <w:bookmarkStart w:id="30" w:name="fig-539a35d47e664c97a50115a146a7f1bd-2"/>
-          <w:p>
-            <w:pPr>
-              <w:pStyle w:val="Compact"/>
-              <w:jc w:val="center"/>
-            </w:pPr>
-            <w:bookmarkStart w:id="29" w:name="fig-539a35d47e664c97a50115a146a7f1bd-2"/>
-            <w:r>
-              <w:drawing>
-                <wp:inline>
-                  <wp:extent cx="5943600" cy="8229600"/>
-                  <wp:effectExtent b="0" l="0" r="0" t="0"/>
-                  <wp:docPr descr=" " title="" id="27" name="Picture"/>
-                  <a:graphic>
-                    <a:graphicData uri="http://schemas.openxmlformats.org/drawingml/2006/picture">
-                      <pic:pic>
-                        <pic:nvPicPr>
-                          <pic:cNvPr descr="images/half_roof_02.png" id="28" name="Picture"/>
-                          <pic:cNvPicPr>
-                            <a:picLocks noChangeArrowheads="1" noChangeAspect="1"/>
-                          </pic:cNvPicPr>
-                        </pic:nvPicPr>
-                        <pic:blipFill>
-                          <a:blip r:embed="rId26"/>
-                          <a:stretch>
-                            <a:fillRect/>
-                          </a:stretch>
-                        </pic:blipFill>
-                        <pic:spPr bwMode="auto">
-                          <a:xfrm>
-                            <a:off x="0" y="0"/>
-                            <a:ext cx="5943600" cy="8229600"/>
-                          </a:xfrm>
-                          <a:prstGeom prst="rect">
-                            <a:avLst/>
-                          </a:prstGeom>
-                          <a:noFill/>
-                          <a:ln w="9525">
-                            <a:noFill/>
-                            <a:headEnd/>
-                            <a:tailEnd/>
-                          </a:ln>
-                        </pic:spPr>
-                      </pic:pic>
-                    </a:graphicData>
-                  </a:graphic>
-                </wp:inline>
-              </w:drawing>
-            </w:r>
-            <w:bookmarkEnd w:id="29"/>
-          </w:p>
-          <w:p>
-            <w:pPr>
-              <w:jc w:val="center"/>
-            </w:pPr>
-            <w:pPr>
-              <w:jc w:val="start"/>
-              <w:spacing w:before="200"/>
-              <w:pStyle w:val="ImageCaption"/>
-            </w:pPr>
-            <w:r>
-              <w:t xml:space="preserve"> </w:t>
-            </w:r>
-          </w:p>
-          <w:bookmarkEnd w:id="30"/>
-        </w:tc>
-      </w:tr>
-    </w:tbl>
+    <w:p>
+      <w:pPr>
+        <w:pStyle w:val="FirstParagraph"/>
+      </w:pPr>
+      <w:r>
+        <w:drawing>
+          <wp:inline>
+            <wp:extent cx="5943600" cy="8229600"/>
+            <wp:effectExtent b="0" l="0" r="0" t="0"/>
+            <wp:docPr descr="" title="" id="25" name="Picture"/>
+            <a:graphic>
+              <a:graphicData uri="http://schemas.openxmlformats.org/drawingml/2006/picture">
+                <pic:pic>
+                  <pic:nvPicPr>
+                    <pic:cNvPr descr="images/half_roof_02.png" id="26" name="Picture"/>
+                    <pic:cNvPicPr>
+                      <a:picLocks noChangeArrowheads="1" noChangeAspect="1"/>
+                    </pic:cNvPicPr>
+                  </pic:nvPicPr>
+                  <pic:blipFill>
+                    <a:blip r:embed="rId24"/>
+                    <a:stretch>
+                      <a:fillRect/>
+                    </a:stretch>
+                  </pic:blipFill>
+                  <pic:spPr bwMode="auto">
+                    <a:xfrm>
+                      <a:off x="0" y="0"/>
+                      <a:ext cx="5943600" cy="8229600"/>
+                    </a:xfrm>
+                    <a:prstGeom prst="rect">
+                      <a:avLst/>
+                    </a:prstGeom>
+                    <a:noFill/>
+                    <a:ln w="9525">
+                      <a:noFill/>
+                      <a:headEnd/>
+                      <a:tailEnd/>
+                    </a:ln>
+                  </pic:spPr>
+                </pic:pic>
+              </a:graphicData>
+            </a:graphic>
+          </wp:inline>
+        </w:drawing>
+      </w:r>
+    </w:p>
+    <w:bookmarkEnd w:id="27"/>
+    <w:bookmarkStart w:id="31" w:name="step-3"/>
+    <w:p>
+      <w:pPr>
+        <w:pStyle w:val="Heading2"/>
+      </w:pPr>
+      <w:r>
+        <w:t xml:space="preserve">Step 3</w:t>
+      </w:r>
+    </w:p>
+    <w:p>
+      <w:pPr>
+        <w:pStyle w:val="Compact"/>
+        <w:numPr>
+          <w:ilvl w:val="0"/>
+          <w:numId w:val="1004"/>
+        </w:numPr>
+      </w:pPr>
+      <w:r>
+        <w:t xml:space="preserve">Three small blocks go between the two end rafters. Start at the top, and for each block</w:t>
+      </w:r>
+    </w:p>
+    <w:p>
+      <w:pPr>
+        <w:pStyle w:val="Compact"/>
+        <w:numPr>
+          <w:ilvl w:val="0"/>
+          <w:numId w:val="1004"/>
+        </w:numPr>
+      </w:pPr>
+      <w:r>
+        <w:t xml:space="preserve">Place a small 6½ inch 2x4 block between the rafters, in the space between a pair of angle irons.</w:t>
+      </w:r>
+    </w:p>
+    <w:p>
+      <w:pPr>
+        <w:pStyle w:val="Compact"/>
+        <w:numPr>
+          <w:ilvl w:val="0"/>
+          <w:numId w:val="1004"/>
+        </w:numPr>
+      </w:pPr>
+      <w:r>
+        <w:t xml:space="preserve">Adjust the position of the block so that it is flush with the rafters at each end. Clamp the rafters below the block</w:t>
+      </w:r>
+    </w:p>
+    <w:p>
+      <w:pPr>
+        <w:pStyle w:val="Compact"/>
+        <w:numPr>
+          <w:ilvl w:val="0"/>
+          <w:numId w:val="1004"/>
+        </w:numPr>
+      </w:pPr>
+      <w:r>
+        <w:t xml:space="preserve">Put 2 long screws into each end of the block through the rafters</w:t>
+      </w:r>
+      <w:r>
+        <w:br/>
+      </w:r>
+      <w:r>
+        <w:t xml:space="preserve">— position screws so that they go into the block near its vertical centerline</w:t>
+      </w:r>
+      <w:r>
+        <w:br/>
+      </w:r>
+      <w:r>
+        <w:t xml:space="preserve">— insert screws about 2 fingers apart, one below the other</w:t>
+      </w:r>
+    </w:p>
+    <w:p>
+      <w:r>
+        <w:br w:type="page"/>
+      </w:r>
+    </w:p>
+    <w:p>
+      <w:pPr>
+        <w:pStyle w:val="FirstParagraph"/>
+      </w:pPr>
+      <w:r>
+        <w:drawing>
+          <wp:inline>
+            <wp:extent cx="5943600" cy="8229600"/>
+            <wp:effectExtent b="0" l="0" r="0" t="0"/>
+            <wp:docPr descr="" title="" id="29" name="Picture"/>
+            <a:graphic>
+              <a:graphicData uri="http://schemas.openxmlformats.org/drawingml/2006/picture">
+                <pic:pic>
+                  <pic:nvPicPr>
+                    <pic:cNvPr descr="images/half_roof_03.png" id="30" name="Picture"/>
+                    <pic:cNvPicPr>
+                      <a:picLocks noChangeArrowheads="1" noChangeAspect="1"/>
+                    </pic:cNvPicPr>
+                  </pic:nvPicPr>
+                  <pic:blipFill>
+                    <a:blip r:embed="rId28"/>
+                    <a:stretch>
+                      <a:fillRect/>
+                    </a:stretch>
+                  </pic:blipFill>
+                  <pic:spPr bwMode="auto">
+                    <a:xfrm>
+                      <a:off x="0" y="0"/>
+                      <a:ext cx="5943600" cy="8229600"/>
+                    </a:xfrm>
+                    <a:prstGeom prst="rect">
+                      <a:avLst/>
+                    </a:prstGeom>
+                    <a:noFill/>
+                    <a:ln w="9525">
+                      <a:noFill/>
+                      <a:headEnd/>
+                      <a:tailEnd/>
+                    </a:ln>
+                  </pic:spPr>
+                </pic:pic>
+              </a:graphicData>
+            </a:graphic>
+          </wp:inline>
+        </w:drawing>
+      </w:r>
+    </w:p>
     <w:bookmarkEnd w:id="31"/>
-    <w:bookmarkStart w:id="37" w:name="step-3"/>
-    <w:p>
-      <w:pPr>
-        <w:pStyle w:val="Heading2"/>
-      </w:pPr>
-      <w:r>
-        <w:t xml:space="preserve">Step 3</w:t>
-      </w:r>
-    </w:p>
-    <w:p>
-      <w:pPr>
-        <w:pStyle w:val="Compact"/>
-        <w:numPr>
-          <w:ilvl w:val="0"/>
-          <w:numId w:val="1004"/>
-        </w:numPr>
-      </w:pPr>
-      <w:r>
-        <w:t xml:space="preserve">Three small blocks go between the two end rafters. Start at the top, and for each block</w:t>
-      </w:r>
-    </w:p>
-    <w:p>
-      <w:pPr>
-        <w:pStyle w:val="Compact"/>
-        <w:numPr>
-          <w:ilvl w:val="0"/>
-          <w:numId w:val="1004"/>
-        </w:numPr>
-      </w:pPr>
-      <w:r>
-        <w:t xml:space="preserve">Place a small 6½ inch 2x4 block between the rafters, in the space between a pair of angle irons.</w:t>
-      </w:r>
-    </w:p>
-    <w:p>
-      <w:pPr>
-        <w:pStyle w:val="Compact"/>
-        <w:numPr>
-          <w:ilvl w:val="0"/>
-          <w:numId w:val="1004"/>
-        </w:numPr>
-      </w:pPr>
-      <w:r>
-        <w:t xml:space="preserve">Adjust the position of the block so that it is flush with the rafters at each end. Clamp the rafters below the block</w:t>
-      </w:r>
-    </w:p>
-    <w:p>
-      <w:pPr>
-        <w:pStyle w:val="Compact"/>
-        <w:numPr>
-          <w:ilvl w:val="0"/>
-          <w:numId w:val="1004"/>
-        </w:numPr>
-      </w:pPr>
-      <w:r>
-        <w:t xml:space="preserve">Put 2 long screws into each end of the block through the rafters</w:t>
-      </w:r>
-      <w:r>
-        <w:br/>
-      </w:r>
-      <w:r>
-        <w:t xml:space="preserve">— position screws so that they go into the block near its vertical centerline</w:t>
-      </w:r>
-      <w:r>
-        <w:br/>
-      </w:r>
-      <w:r>
-        <w:t xml:space="preserve">— insert screws about 2 fingers apart, one below the other</w:t>
-      </w:r>
-    </w:p>
-    <w:p>
-      <w:r>
-        <w:br w:type="page"/>
-      </w:r>
-    </w:p>
-    <w:tbl>
-      <w:tblPr>
-        <w:tblStyle w:val="Table"/>
-        <w:tblW w:type="pct" w:w="5000"/>
-        <w:tblLayout w:type="fixed"/>
-        <w:tblLook w:firstRow="0" w:lastRow="0" w:firstColumn="0" w:lastColumn="0" w:noHBand="0" w:noVBand="0" w:val="0000"/>
-      </w:tblPr>
-      <w:tblGrid>
-        <w:gridCol w:w="7920"/>
-      </w:tblGrid>
-      <w:tr>
-        <w:tc>
-          <w:tcPr/>
-          <w:bookmarkStart w:id="36" w:name="fig-539a35d47e664c97a50115a146a7f1bd-3"/>
-          <w:p>
-            <w:pPr>
-              <w:pStyle w:val="Compact"/>
-              <w:jc w:val="center"/>
-            </w:pPr>
-            <w:bookmarkStart w:id="35" w:name="fig-539a35d47e664c97a50115a146a7f1bd-3"/>
-            <w:r>
-              <w:drawing>
-                <wp:inline>
-                  <wp:extent cx="5943600" cy="8229600"/>
-                  <wp:effectExtent b="0" l="0" r="0" t="0"/>
-                  <wp:docPr descr=" " title="" id="33" name="Picture"/>
-                  <a:graphic>
-                    <a:graphicData uri="http://schemas.openxmlformats.org/drawingml/2006/picture">
-                      <pic:pic>
-                        <pic:nvPicPr>
-                          <pic:cNvPr descr="images/half_roof_03.png" id="34" name="Picture"/>
-                          <pic:cNvPicPr>
-                            <a:picLocks noChangeArrowheads="1" noChangeAspect="1"/>
-                          </pic:cNvPicPr>
-                        </pic:nvPicPr>
-                        <pic:blipFill>
-                          <a:blip r:embed="rId32"/>
-                          <a:stretch>
-                            <a:fillRect/>
-                          </a:stretch>
-                        </pic:blipFill>
-                        <pic:spPr bwMode="auto">
-                          <a:xfrm>
-                            <a:off x="0" y="0"/>
-                            <a:ext cx="5943600" cy="8229600"/>
-                          </a:xfrm>
-                          <a:prstGeom prst="rect">
-                            <a:avLst/>
-                          </a:prstGeom>
-                          <a:noFill/>
-                          <a:ln w="9525">
-                            <a:noFill/>
-                            <a:headEnd/>
-                            <a:tailEnd/>
-                          </a:ln>
-                        </pic:spPr>
-                      </pic:pic>
-                    </a:graphicData>
-                  </a:graphic>
-                </wp:inline>
-              </w:drawing>
-            </w:r>
-            <w:bookmarkEnd w:id="35"/>
-          </w:p>
-          <w:p>
-            <w:pPr>
-              <w:jc w:val="center"/>
-            </w:pPr>
-            <w:pPr>
-              <w:jc w:val="start"/>
-              <w:spacing w:before="200"/>
-              <w:pStyle w:val="ImageCaption"/>
-            </w:pPr>
-            <w:r>
-              <w:t xml:space="preserve"> </w:t>
-            </w:r>
-          </w:p>
-          <w:bookmarkEnd w:id="36"/>
-        </w:tc>
-      </w:tr>
-    </w:tbl>
-    <w:bookmarkEnd w:id="37"/>
-    <w:bookmarkStart w:id="43" w:name="step-4"/>
+    <w:bookmarkStart w:id="35" w:name="step-4"/>
     <w:p>
       <w:pPr>
         <w:pStyle w:val="Heading2"/>
@@ -747,149 +645,332 @@
         <w:br w:type="page"/>
       </w:r>
     </w:p>
-    <w:tbl>
-      <w:tblPr>
-        <w:tblStyle w:val="Table"/>
-        <w:tblW w:type="pct" w:w="5000"/>
-        <w:tblLayout w:type="fixed"/>
-        <w:tblLook w:firstRow="0" w:lastRow="0" w:firstColumn="0" w:lastColumn="0" w:noHBand="0" w:noVBand="0" w:val="0000"/>
-      </w:tblPr>
-      <w:tblGrid>
-        <w:gridCol w:w="7920"/>
-      </w:tblGrid>
-      <w:tr>
-        <w:tc>
-          <w:tcPr/>
-          <w:bookmarkStart w:id="42" w:name="fig-539a35d47e664c97a50115a146a7f1bd-4"/>
-          <w:p>
-            <w:pPr>
-              <w:pStyle w:val="Compact"/>
-              <w:jc w:val="center"/>
-            </w:pPr>
-            <w:bookmarkStart w:id="41" w:name="fig-539a35d47e664c97a50115a146a7f1bd-4"/>
-            <w:r>
-              <w:drawing>
-                <wp:inline>
-                  <wp:extent cx="5943600" cy="8229600"/>
-                  <wp:effectExtent b="0" l="0" r="0" t="0"/>
-                  <wp:docPr descr=" " title="" id="39" name="Picture"/>
-                  <a:graphic>
-                    <a:graphicData uri="http://schemas.openxmlformats.org/drawingml/2006/picture">
-                      <pic:pic>
-                        <pic:nvPicPr>
-                          <pic:cNvPr descr="images/half_roof_04.png" id="40" name="Picture"/>
-                          <pic:cNvPicPr>
-                            <a:picLocks noChangeArrowheads="1" noChangeAspect="1"/>
-                          </pic:cNvPicPr>
-                        </pic:nvPicPr>
-                        <pic:blipFill>
-                          <a:blip r:embed="rId38"/>
-                          <a:stretch>
-                            <a:fillRect/>
-                          </a:stretch>
-                        </pic:blipFill>
-                        <pic:spPr bwMode="auto">
-                          <a:xfrm>
-                            <a:off x="0" y="0"/>
-                            <a:ext cx="5943600" cy="8229600"/>
-                          </a:xfrm>
-                          <a:prstGeom prst="rect">
-                            <a:avLst/>
-                          </a:prstGeom>
-                          <a:noFill/>
-                          <a:ln w="9525">
-                            <a:noFill/>
-                            <a:headEnd/>
-                            <a:tailEnd/>
-                          </a:ln>
-                        </pic:spPr>
-                      </pic:pic>
-                    </a:graphicData>
-                  </a:graphic>
-                </wp:inline>
-              </w:drawing>
-            </w:r>
-            <w:bookmarkEnd w:id="41"/>
-          </w:p>
-          <w:p>
-            <w:pPr>
-              <w:jc w:val="center"/>
-            </w:pPr>
-            <w:pPr>
-              <w:jc w:val="start"/>
-              <w:spacing w:before="200"/>
-              <w:pStyle w:val="ImageCaption"/>
-            </w:pPr>
-            <w:r>
-              <w:t xml:space="preserve"> </w:t>
-            </w:r>
-          </w:p>
-          <w:bookmarkEnd w:id="42"/>
-        </w:tc>
-      </w:tr>
-    </w:tbl>
+    <w:p>
+      <w:pPr>
+        <w:pStyle w:val="FirstParagraph"/>
+      </w:pPr>
+      <w:r>
+        <w:drawing>
+          <wp:inline>
+            <wp:extent cx="5943600" cy="8229600"/>
+            <wp:effectExtent b="0" l="0" r="0" t="0"/>
+            <wp:docPr descr="" title="" id="33" name="Picture"/>
+            <a:graphic>
+              <a:graphicData uri="http://schemas.openxmlformats.org/drawingml/2006/picture">
+                <pic:pic>
+                  <pic:nvPicPr>
+                    <pic:cNvPr descr="images/half_roof_04.png" id="34" name="Picture"/>
+                    <pic:cNvPicPr>
+                      <a:picLocks noChangeArrowheads="1" noChangeAspect="1"/>
+                    </pic:cNvPicPr>
+                  </pic:nvPicPr>
+                  <pic:blipFill>
+                    <a:blip r:embed="rId32"/>
+                    <a:stretch>
+                      <a:fillRect/>
+                    </a:stretch>
+                  </pic:blipFill>
+                  <pic:spPr bwMode="auto">
+                    <a:xfrm>
+                      <a:off x="0" y="0"/>
+                      <a:ext cx="5943600" cy="8229600"/>
+                    </a:xfrm>
+                    <a:prstGeom prst="rect">
+                      <a:avLst/>
+                    </a:prstGeom>
+                    <a:noFill/>
+                    <a:ln w="9525">
+                      <a:noFill/>
+                      <a:headEnd/>
+                      <a:tailEnd/>
+                    </a:ln>
+                  </pic:spPr>
+                </pic:pic>
+              </a:graphicData>
+            </a:graphic>
+          </wp:inline>
+        </w:drawing>
+      </w:r>
+    </w:p>
+    <w:bookmarkEnd w:id="35"/>
+    <w:bookmarkStart w:id="39" w:name="step-5"/>
+    <w:p>
+      <w:pPr>
+        <w:pStyle w:val="Heading2"/>
+      </w:pPr>
+      <w:r>
+        <w:t xml:space="preserve">Step 5</w:t>
+      </w:r>
+    </w:p>
+    <w:p>
+      <w:pPr>
+        <w:pStyle w:val="Compact"/>
+        <w:numPr>
+          <w:ilvl w:val="0"/>
+          <w:numId w:val="1006"/>
+        </w:numPr>
+      </w:pPr>
+      <w:r>
+        <w:t xml:space="preserve">Place a 1x8 white board on the rafter ends at the bottom. Note that there are 1x6 white boards in the same rack. Do not use the narrower board for this step.</w:t>
+      </w:r>
+      <w:r>
+        <w:br/>
+      </w:r>
+      <w:r>
+        <w:t xml:space="preserve">— line up and clamp the right end and then the left end</w:t>
+      </w:r>
+      <w:r>
+        <w:br/>
+      </w:r>
+      <w:r>
+        <w:t xml:space="preserve">— make sure white board is flush with the outside rafter on the right end</w:t>
+      </w:r>
+    </w:p>
+    <w:p>
+      <w:pPr>
+        <w:pStyle w:val="Compact"/>
+        <w:numPr>
+          <w:ilvl w:val="0"/>
+          <w:numId w:val="1006"/>
+        </w:numPr>
+      </w:pPr>
+      <w:r>
+        <w:t xml:space="preserve">Working your way from the right end (top of the diagram), align the bottom edge of the white board flush with the end of each rafter. Pre-drill through the white board and place 1 SHORT SCREW into each rafter</w:t>
+      </w:r>
+      <w:r>
+        <w:br/>
+      </w:r>
+      <w:r>
+        <w:t xml:space="preserve">— use funky board #9 to push the white board out to be flush with the end of each rafter, or push the white board toward the top of the assembly if it hangs over the rafter end</w:t>
+      </w:r>
+    </w:p>
+    <w:p>
+      <w:r>
+        <w:br w:type="page"/>
+      </w:r>
+    </w:p>
+    <w:p>
+      <w:pPr>
+        <w:pStyle w:val="FirstParagraph"/>
+      </w:pPr>
+      <w:r>
+        <w:drawing>
+          <wp:inline>
+            <wp:extent cx="5943600" cy="8229600"/>
+            <wp:effectExtent b="0" l="0" r="0" t="0"/>
+            <wp:docPr descr="" title="" id="37" name="Picture"/>
+            <a:graphic>
+              <a:graphicData uri="http://schemas.openxmlformats.org/drawingml/2006/picture">
+                <pic:pic>
+                  <pic:nvPicPr>
+                    <pic:cNvPr descr="images/half_roof_05.png" id="38" name="Picture"/>
+                    <pic:cNvPicPr>
+                      <a:picLocks noChangeArrowheads="1" noChangeAspect="1"/>
+                    </pic:cNvPicPr>
+                  </pic:nvPicPr>
+                  <pic:blipFill>
+                    <a:blip r:embed="rId36"/>
+                    <a:stretch>
+                      <a:fillRect/>
+                    </a:stretch>
+                  </pic:blipFill>
+                  <pic:spPr bwMode="auto">
+                    <a:xfrm>
+                      <a:off x="0" y="0"/>
+                      <a:ext cx="5943600" cy="8229600"/>
+                    </a:xfrm>
+                    <a:prstGeom prst="rect">
+                      <a:avLst/>
+                    </a:prstGeom>
+                    <a:noFill/>
+                    <a:ln w="9525">
+                      <a:noFill/>
+                      <a:headEnd/>
+                      <a:tailEnd/>
+                    </a:ln>
+                  </pic:spPr>
+                </pic:pic>
+              </a:graphicData>
+            </a:graphic>
+          </wp:inline>
+        </w:drawing>
+      </w:r>
+    </w:p>
+    <w:bookmarkEnd w:id="39"/>
+    <w:bookmarkStart w:id="43" w:name="step-6"/>
+    <w:p>
+      <w:pPr>
+        <w:pStyle w:val="Heading2"/>
+      </w:pPr>
+      <w:r>
+        <w:t xml:space="preserve">Step 6</w:t>
+      </w:r>
+    </w:p>
+    <w:p>
+      <w:pPr>
+        <w:pStyle w:val="Compact"/>
+        <w:numPr>
+          <w:ilvl w:val="0"/>
+          <w:numId w:val="1007"/>
+        </w:numPr>
+      </w:pPr>
+      <w:r>
+        <w:t xml:space="preserve">Pre-drill and place a 2nd SHORT SCREW at each rafter</w:t>
+      </w:r>
+      <w:r>
+        <w:br/>
+      </w:r>
+      <w:r>
+        <w:t xml:space="preserve">— repeat all the way across the top of the 1x8 white board</w:t>
+      </w:r>
+    </w:p>
+    <w:p>
+      <w:pPr>
+        <w:pStyle w:val="Compact"/>
+        <w:numPr>
+          <w:ilvl w:val="0"/>
+          <w:numId w:val="1007"/>
+        </w:numPr>
+      </w:pPr>
+      <w:r>
+        <w:t xml:space="preserve">If white board extends past the left edge of the outside rafter, use a router to trim it flush.</w:t>
+      </w:r>
+    </w:p>
+    <w:p>
+      <w:r>
+        <w:br w:type="page"/>
+      </w:r>
+    </w:p>
+    <w:p>
+      <w:pPr>
+        <w:pStyle w:val="FirstParagraph"/>
+      </w:pPr>
+      <w:r>
+        <w:drawing>
+          <wp:inline>
+            <wp:extent cx="5943600" cy="8229600"/>
+            <wp:effectExtent b="0" l="0" r="0" t="0"/>
+            <wp:docPr descr="" title="" id="41" name="Picture"/>
+            <a:graphic>
+              <a:graphicData uri="http://schemas.openxmlformats.org/drawingml/2006/picture">
+                <pic:pic>
+                  <pic:nvPicPr>
+                    <pic:cNvPr descr="images/half_roof_06.png" id="42" name="Picture"/>
+                    <pic:cNvPicPr>
+                      <a:picLocks noChangeArrowheads="1" noChangeAspect="1"/>
+                    </pic:cNvPicPr>
+                  </pic:nvPicPr>
+                  <pic:blipFill>
+                    <a:blip r:embed="rId40"/>
+                    <a:stretch>
+                      <a:fillRect/>
+                    </a:stretch>
+                  </pic:blipFill>
+                  <pic:spPr bwMode="auto">
+                    <a:xfrm>
+                      <a:off x="0" y="0"/>
+                      <a:ext cx="5943600" cy="8229600"/>
+                    </a:xfrm>
+                    <a:prstGeom prst="rect">
+                      <a:avLst/>
+                    </a:prstGeom>
+                    <a:noFill/>
+                    <a:ln w="9525">
+                      <a:noFill/>
+                      <a:headEnd/>
+                      <a:tailEnd/>
+                    </a:ln>
+                  </pic:spPr>
+                </pic:pic>
+              </a:graphicData>
+            </a:graphic>
+          </wp:inline>
+        </w:drawing>
+      </w:r>
+    </w:p>
     <w:bookmarkEnd w:id="43"/>
-    <w:bookmarkStart w:id="49" w:name="step-5"/>
+    <w:bookmarkStart w:id="47" w:name="step-7"/>
     <w:p>
       <w:pPr>
         <w:pStyle w:val="Heading2"/>
       </w:pPr>
       <w:r>
-        <w:t xml:space="preserve">Step 5</w:t>
-      </w:r>
-    </w:p>
-    <w:p>
-      <w:pPr>
-        <w:pStyle w:val="Compact"/>
-        <w:numPr>
-          <w:ilvl w:val="0"/>
-          <w:numId w:val="1006"/>
-        </w:numPr>
-      </w:pPr>
-      <w:r>
-        <w:t xml:space="preserve">Place a 1x8 white board on the rafter ends at the bottom</w:t>
+        <w:t xml:space="preserve">Step 7</w:t>
+      </w:r>
+    </w:p>
+    <w:p>
+      <w:pPr>
+        <w:numPr>
+          <w:ilvl w:val="0"/>
+          <w:numId w:val="1008"/>
+        </w:numPr>
+      </w:pPr>
+      <w:r>
+        <w:t xml:space="preserve">Countersink pre-drill on each of the inner rafters</w:t>
       </w:r>
       <w:r>
         <w:br/>
       </w:r>
       <w:r>
-        <w:t xml:space="preserve">— line up and clamp the right end and then the left end</w:t>
+        <w:t xml:space="preserve">— See diagram</w:t>
       </w:r>
       <w:r>
         <w:br/>
       </w:r>
       <w:r>
-        <w:t xml:space="preserve">— make sure white board is flush with the outside rafter on the right end</w:t>
-      </w:r>
-    </w:p>
-    <w:p>
-      <w:pPr>
-        <w:pStyle w:val="Compact"/>
-        <w:numPr>
-          <w:ilvl w:val="0"/>
-          <w:numId w:val="1006"/>
-        </w:numPr>
-      </w:pPr>
-      <w:r>
-        <w:t xml:space="preserve">Working your way from the left end, align the bottom edge of the white board flush with the end of each rafter. Pre-drill and place 1 SHORT SCREW into each rafter</w:t>
+        <w:t xml:space="preserve">— Use 13/16” spade bit</w:t>
       </w:r>
       <w:r>
         <w:br/>
       </w:r>
       <w:r>
-        <w:t xml:space="preserve">— use funky board #9 to push the white board out to be flush with the end of each rafter, or push the white board toward the top of the assembly if it hangs over the rafter end</w:t>
-      </w:r>
-    </w:p>
-    <w:p>
-      <w:pPr>
-        <w:pStyle w:val="Compact"/>
-        <w:numPr>
-          <w:ilvl w:val="0"/>
-          <w:numId w:val="1006"/>
-        </w:numPr>
-      </w:pPr>
-      <w:r>
-        <w:t xml:space="preserve">If white board extends past the left edge of the outside rafter, use a router to trim it flush.</w:t>
+        <w:t xml:space="preserve">— Bottom edge of hole 1/2” above the 1x8 white board</w:t>
+      </w:r>
+      <w:r>
+        <w:br/>
+      </w:r>
+      <w:r>
+        <w:t xml:space="preserve">— drill perpendicular to the floor, not the white board</w:t>
+      </w:r>
+      <w:r>
+        <w:br/>
+      </w:r>
+      <w:r>
+        <w:t xml:space="preserve">— drill bits in plastic container at station 5</w:t>
+      </w:r>
+    </w:p>
+    <w:p>
+      <w:pPr>
+        <w:numPr>
+          <w:ilvl w:val="0"/>
+          <w:numId w:val="1008"/>
+        </w:numPr>
+      </w:pPr>
+      <w:r>
+        <w:t xml:space="preserve">Drill in each of those holes with a straight drill bit</w:t>
+      </w:r>
+      <w:r>
+        <w:br/>
+      </w:r>
+      <w:r>
+        <w:t xml:space="preserve">— bit in the plastic container</w:t>
+      </w:r>
+      <w:r>
+        <w:br/>
+      </w:r>
+      <w:r>
+        <w:t xml:space="preserve">— drill perpendicular to the floor</w:t>
+      </w:r>
+    </w:p>
+    <w:p>
+      <w:pPr>
+        <w:numPr>
+          <w:ilvl w:val="0"/>
+          <w:numId w:val="1008"/>
+        </w:numPr>
+      </w:pPr>
+      <w:r>
+        <w:t xml:space="preserve">Make a mark on the bottom inside of the 1x6 white board (at the top of the jig) 6¼ inches in from each end. This will help to align the half roof when it is installed on the home. There is a pattern block that will make this easy; that block fits over the end of the 1x6 white board.</w:t>
       </w:r>
     </w:p>
     <w:p>
@@ -897,444 +978,125 @@
         <w:br w:type="page"/>
       </w:r>
     </w:p>
-    <w:tbl>
-      <w:tblPr>
-        <w:tblStyle w:val="Table"/>
-        <w:tblW w:type="pct" w:w="5000"/>
-        <w:tblLayout w:type="fixed"/>
-        <w:tblLook w:firstRow="0" w:lastRow="0" w:firstColumn="0" w:lastColumn="0" w:noHBand="0" w:noVBand="0" w:val="0000"/>
-      </w:tblPr>
-      <w:tblGrid>
-        <w:gridCol w:w="7920"/>
-      </w:tblGrid>
-      <w:tr>
-        <w:tc>
-          <w:tcPr/>
-          <w:bookmarkStart w:id="48" w:name="fig-539a35d47e664c97a50115a146a7f1bd-5"/>
-          <w:p>
-            <w:pPr>
-              <w:pStyle w:val="Compact"/>
-              <w:jc w:val="center"/>
-            </w:pPr>
-            <w:bookmarkStart w:id="47" w:name="fig-539a35d47e664c97a50115a146a7f1bd-5"/>
-            <w:r>
-              <w:drawing>
-                <wp:inline>
-                  <wp:extent cx="5943600" cy="8229600"/>
-                  <wp:effectExtent b="0" l="0" r="0" t="0"/>
-                  <wp:docPr descr=" " title="" id="45" name="Picture"/>
-                  <a:graphic>
-                    <a:graphicData uri="http://schemas.openxmlformats.org/drawingml/2006/picture">
-                      <pic:pic>
-                        <pic:nvPicPr>
-                          <pic:cNvPr descr="images/half_roof_05.png" id="46" name="Picture"/>
-                          <pic:cNvPicPr>
-                            <a:picLocks noChangeArrowheads="1" noChangeAspect="1"/>
-                          </pic:cNvPicPr>
-                        </pic:nvPicPr>
-                        <pic:blipFill>
-                          <a:blip r:embed="rId44"/>
-                          <a:stretch>
-                            <a:fillRect/>
-                          </a:stretch>
-                        </pic:blipFill>
-                        <pic:spPr bwMode="auto">
-                          <a:xfrm>
-                            <a:off x="0" y="0"/>
-                            <a:ext cx="5943600" cy="8229600"/>
-                          </a:xfrm>
-                          <a:prstGeom prst="rect">
-                            <a:avLst/>
-                          </a:prstGeom>
-                          <a:noFill/>
-                          <a:ln w="9525">
-                            <a:noFill/>
-                            <a:headEnd/>
-                            <a:tailEnd/>
-                          </a:ln>
-                        </pic:spPr>
-                      </pic:pic>
-                    </a:graphicData>
-                  </a:graphic>
-                </wp:inline>
-              </w:drawing>
-            </w:r>
-            <w:bookmarkEnd w:id="47"/>
-          </w:p>
-          <w:p>
-            <w:pPr>
-              <w:jc w:val="center"/>
-            </w:pPr>
-            <w:pPr>
-              <w:jc w:val="start"/>
-              <w:spacing w:before="200"/>
-              <w:pStyle w:val="ImageCaption"/>
-            </w:pPr>
-            <w:r>
-              <w:t xml:space="preserve"> </w:t>
-            </w:r>
-          </w:p>
-          <w:bookmarkEnd w:id="48"/>
-        </w:tc>
-      </w:tr>
-    </w:tbl>
+    <w:p>
+      <w:pPr>
+        <w:pStyle w:val="FirstParagraph"/>
+      </w:pPr>
+      <w:r>
+        <w:drawing>
+          <wp:inline>
+            <wp:extent cx="5943600" cy="8229600"/>
+            <wp:effectExtent b="0" l="0" r="0" t="0"/>
+            <wp:docPr descr="" title="" id="45" name="Picture"/>
+            <a:graphic>
+              <a:graphicData uri="http://schemas.openxmlformats.org/drawingml/2006/picture">
+                <pic:pic>
+                  <pic:nvPicPr>
+                    <pic:cNvPr descr="images/half_roof_07.png" id="46" name="Picture"/>
+                    <pic:cNvPicPr>
+                      <a:picLocks noChangeArrowheads="1" noChangeAspect="1"/>
+                    </pic:cNvPicPr>
+                  </pic:nvPicPr>
+                  <pic:blipFill>
+                    <a:blip r:embed="rId44"/>
+                    <a:stretch>
+                      <a:fillRect/>
+                    </a:stretch>
+                  </pic:blipFill>
+                  <pic:spPr bwMode="auto">
+                    <a:xfrm>
+                      <a:off x="0" y="0"/>
+                      <a:ext cx="5943600" cy="8229600"/>
+                    </a:xfrm>
+                    <a:prstGeom prst="rect">
+                      <a:avLst/>
+                    </a:prstGeom>
+                    <a:noFill/>
+                    <a:ln w="9525">
+                      <a:noFill/>
+                      <a:headEnd/>
+                      <a:tailEnd/>
+                    </a:ln>
+                  </pic:spPr>
+                </pic:pic>
+              </a:graphicData>
+            </a:graphic>
+          </wp:inline>
+        </w:drawing>
+      </w:r>
+    </w:p>
+    <w:bookmarkEnd w:id="47"/>
+    <w:bookmarkStart w:id="48" w:name="remove-half-roof"/>
+    <w:p>
+      <w:pPr>
+        <w:pStyle w:val="Heading2"/>
+      </w:pPr>
+      <w:r>
+        <w:t xml:space="preserve">Remove Half Roof</w:t>
+      </w:r>
+    </w:p>
+    <w:p>
+      <w:pPr>
+        <w:pStyle w:val="Compact"/>
+        <w:numPr>
+          <w:ilvl w:val="0"/>
+          <w:numId w:val="1009"/>
+        </w:numPr>
+      </w:pPr>
+      <w:r>
+        <w:t xml:space="preserve">Remove the half roof by going down the top with a crowbar</w:t>
+      </w:r>
+      <w:r>
+        <w:br/>
+      </w:r>
+      <w:r>
+        <w:t xml:space="preserve">— Gently lift as you make your way to the other end</w:t>
+      </w:r>
+      <w:r>
+        <w:br/>
+      </w:r>
+      <w:r>
+        <w:t xml:space="preserve">— Do not force the top white board, especially at the ends.</w:t>
+      </w:r>
+      <w:r>
+        <w:t xml:space="preserve"> </w:t>
+      </w:r>
+      <w:r>
+        <w:t xml:space="preserve">If gentle prying does not free the board, raise the end rafters from the bottom to free the assembly.</w:t>
+      </w:r>
+    </w:p>
+    <w:p>
+      <w:pPr>
+        <w:pStyle w:val="Compact"/>
+        <w:numPr>
+          <w:ilvl w:val="0"/>
+          <w:numId w:val="1009"/>
+        </w:numPr>
+      </w:pPr>
+      <w:r>
+        <w:t xml:space="preserve">On both ends, lift the high side upwards</w:t>
+      </w:r>
+      <w:r>
+        <w:br/>
+      </w:r>
+      <w:r>
+        <w:t xml:space="preserve">— towards being perpendicular with the floor</w:t>
+      </w:r>
+      <w:r>
+        <w:br/>
+      </w:r>
+      <w:r>
+        <w:t xml:space="preserve">— it will work its way off the jig</w:t>
+      </w:r>
+    </w:p>
+    <w:p>
+      <w:r>
+        <w:br w:type="page"/>
+      </w:r>
+    </w:p>
+    <w:bookmarkEnd w:id="48"/>
     <w:bookmarkEnd w:id="49"/>
-    <w:bookmarkStart w:id="55" w:name="step-6"/>
-    <w:p>
-      <w:pPr>
-        <w:pStyle w:val="Heading2"/>
-      </w:pPr>
-      <w:r>
-        <w:t xml:space="preserve">Step 6</w:t>
-      </w:r>
-    </w:p>
-    <w:p>
-      <w:pPr>
-        <w:pStyle w:val="Compact"/>
-        <w:numPr>
-          <w:ilvl w:val="0"/>
-          <w:numId w:val="1007"/>
-        </w:numPr>
-      </w:pPr>
-      <w:r>
-        <w:t xml:space="preserve">Pre-drill and place a 2nd SHORT SCREW at each rafter</w:t>
-      </w:r>
-      <w:r>
-        <w:br/>
-      </w:r>
-      <w:r>
-        <w:t xml:space="preserve">— repeat all the way across the top of the 1x8 white board</w:t>
-      </w:r>
-    </w:p>
-    <w:p>
-      <w:r>
-        <w:br w:type="page"/>
-      </w:r>
-    </w:p>
-    <w:tbl>
-      <w:tblPr>
-        <w:tblStyle w:val="Table"/>
-        <w:tblW w:type="pct" w:w="5000"/>
-        <w:tblLayout w:type="fixed"/>
-        <w:tblLook w:firstRow="0" w:lastRow="0" w:firstColumn="0" w:lastColumn="0" w:noHBand="0" w:noVBand="0" w:val="0000"/>
-      </w:tblPr>
-      <w:tblGrid>
-        <w:gridCol w:w="7920"/>
-      </w:tblGrid>
-      <w:tr>
-        <w:tc>
-          <w:tcPr/>
-          <w:bookmarkStart w:id="54" w:name="fig-539a35d47e664c97a50115a146a7f1bd-6"/>
-          <w:p>
-            <w:pPr>
-              <w:pStyle w:val="Compact"/>
-              <w:jc w:val="center"/>
-            </w:pPr>
-            <w:bookmarkStart w:id="53" w:name="fig-539a35d47e664c97a50115a146a7f1bd-6"/>
-            <w:r>
-              <w:drawing>
-                <wp:inline>
-                  <wp:extent cx="5943600" cy="8229600"/>
-                  <wp:effectExtent b="0" l="0" r="0" t="0"/>
-                  <wp:docPr descr=" " title="" id="51" name="Picture"/>
-                  <a:graphic>
-                    <a:graphicData uri="http://schemas.openxmlformats.org/drawingml/2006/picture">
-                      <pic:pic>
-                        <pic:nvPicPr>
-                          <pic:cNvPr descr="images/half_roof_06.png" id="52" name="Picture"/>
-                          <pic:cNvPicPr>
-                            <a:picLocks noChangeArrowheads="1" noChangeAspect="1"/>
-                          </pic:cNvPicPr>
-                        </pic:nvPicPr>
-                        <pic:blipFill>
-                          <a:blip r:embed="rId50"/>
-                          <a:stretch>
-                            <a:fillRect/>
-                          </a:stretch>
-                        </pic:blipFill>
-                        <pic:spPr bwMode="auto">
-                          <a:xfrm>
-                            <a:off x="0" y="0"/>
-                            <a:ext cx="5943600" cy="8229600"/>
-                          </a:xfrm>
-                          <a:prstGeom prst="rect">
-                            <a:avLst/>
-                          </a:prstGeom>
-                          <a:noFill/>
-                          <a:ln w="9525">
-                            <a:noFill/>
-                            <a:headEnd/>
-                            <a:tailEnd/>
-                          </a:ln>
-                        </pic:spPr>
-                      </pic:pic>
-                    </a:graphicData>
-                  </a:graphic>
-                </wp:inline>
-              </w:drawing>
-            </w:r>
-            <w:bookmarkEnd w:id="53"/>
-          </w:p>
-          <w:p>
-            <w:pPr>
-              <w:jc w:val="center"/>
-            </w:pPr>
-            <w:pPr>
-              <w:jc w:val="start"/>
-              <w:spacing w:before="200"/>
-              <w:pStyle w:val="ImageCaption"/>
-            </w:pPr>
-            <w:r>
-              <w:t xml:space="preserve"> </w:t>
-            </w:r>
-          </w:p>
-          <w:bookmarkEnd w:id="54"/>
-        </w:tc>
-      </w:tr>
-    </w:tbl>
-    <w:bookmarkEnd w:id="55"/>
-    <w:bookmarkStart w:id="61" w:name="step-7"/>
-    <w:p>
-      <w:pPr>
-        <w:pStyle w:val="Heading2"/>
-      </w:pPr>
-      <w:r>
-        <w:t xml:space="preserve">Step 7</w:t>
-      </w:r>
-    </w:p>
-    <w:p>
-      <w:pPr>
-        <w:numPr>
-          <w:ilvl w:val="0"/>
-          <w:numId w:val="1008"/>
-        </w:numPr>
-      </w:pPr>
-      <w:r>
-        <w:t xml:space="preserve">Countersink pre-drill on each of the inner rafters</w:t>
-      </w:r>
-      <w:r>
-        <w:br/>
-      </w:r>
-      <w:r>
-        <w:t xml:space="preserve">— See diagram</w:t>
-      </w:r>
-      <w:r>
-        <w:br/>
-      </w:r>
-      <w:r>
-        <w:t xml:space="preserve">— Use 13/16” spade bit</w:t>
-      </w:r>
-      <w:r>
-        <w:br/>
-      </w:r>
-      <w:r>
-        <w:t xml:space="preserve">— Bottom edge of hole 1/2” above the 1x8 white board</w:t>
-      </w:r>
-      <w:r>
-        <w:br/>
-      </w:r>
-      <w:r>
-        <w:t xml:space="preserve">— drill perpendicular to the floor, not the white board</w:t>
-      </w:r>
-      <w:r>
-        <w:br/>
-      </w:r>
-      <w:r>
-        <w:t xml:space="preserve">— drill bits in plastic container at station 5</w:t>
-      </w:r>
-    </w:p>
-    <w:p>
-      <w:pPr>
-        <w:numPr>
-          <w:ilvl w:val="0"/>
-          <w:numId w:val="1008"/>
-        </w:numPr>
-      </w:pPr>
-      <w:r>
-        <w:t xml:space="preserve">Drill in each of those holes with a straight drill bit</w:t>
-      </w:r>
-      <w:r>
-        <w:br/>
-      </w:r>
-      <w:r>
-        <w:t xml:space="preserve">— bit in the plastic container</w:t>
-      </w:r>
-      <w:r>
-        <w:br/>
-      </w:r>
-      <w:r>
-        <w:t xml:space="preserve">— drill perpendicular to the floor</w:t>
-      </w:r>
-    </w:p>
-    <w:p>
-      <w:pPr>
-        <w:numPr>
-          <w:ilvl w:val="0"/>
-          <w:numId w:val="1008"/>
-        </w:numPr>
-      </w:pPr>
-      <w:r>
-        <w:t xml:space="preserve">Make a mark on the bottom inside of the 1x6 white board (at the top of the jig) 6¼ inches in from each end. This will help to align the half roof when it is installed on the home. There is a pattern block that will make this easy; that block fits over the end of the 1x6 white board.</w:t>
-      </w:r>
-    </w:p>
-    <w:p>
-      <w:r>
-        <w:br w:type="page"/>
-      </w:r>
-    </w:p>
-    <w:tbl>
-      <w:tblPr>
-        <w:tblStyle w:val="Table"/>
-        <w:tblW w:type="pct" w:w="5000"/>
-        <w:tblLayout w:type="fixed"/>
-        <w:tblLook w:firstRow="0" w:lastRow="0" w:firstColumn="0" w:lastColumn="0" w:noHBand="0" w:noVBand="0" w:val="0000"/>
-      </w:tblPr>
-      <w:tblGrid>
-        <w:gridCol w:w="7920"/>
-      </w:tblGrid>
-      <w:tr>
-        <w:tc>
-          <w:tcPr/>
-          <w:bookmarkStart w:id="60" w:name="fig-539a35d47e664c97a50115a146a7f1bd-7"/>
-          <w:p>
-            <w:pPr>
-              <w:pStyle w:val="Compact"/>
-              <w:jc w:val="center"/>
-            </w:pPr>
-            <w:bookmarkStart w:id="59" w:name="fig-539a35d47e664c97a50115a146a7f1bd-7"/>
-            <w:r>
-              <w:drawing>
-                <wp:inline>
-                  <wp:extent cx="5943600" cy="8229600"/>
-                  <wp:effectExtent b="0" l="0" r="0" t="0"/>
-                  <wp:docPr descr=" " title="" id="57" name="Picture"/>
-                  <a:graphic>
-                    <a:graphicData uri="http://schemas.openxmlformats.org/drawingml/2006/picture">
-                      <pic:pic>
-                        <pic:nvPicPr>
-                          <pic:cNvPr descr="images/half_roof_07.png" id="58" name="Picture"/>
-                          <pic:cNvPicPr>
-                            <a:picLocks noChangeArrowheads="1" noChangeAspect="1"/>
-                          </pic:cNvPicPr>
-                        </pic:nvPicPr>
-                        <pic:blipFill>
-                          <a:blip r:embed="rId56"/>
-                          <a:stretch>
-                            <a:fillRect/>
-                          </a:stretch>
-                        </pic:blipFill>
-                        <pic:spPr bwMode="auto">
-                          <a:xfrm>
-                            <a:off x="0" y="0"/>
-                            <a:ext cx="5943600" cy="8229600"/>
-                          </a:xfrm>
-                          <a:prstGeom prst="rect">
-                            <a:avLst/>
-                          </a:prstGeom>
-                          <a:noFill/>
-                          <a:ln w="9525">
-                            <a:noFill/>
-                            <a:headEnd/>
-                            <a:tailEnd/>
-                          </a:ln>
-                        </pic:spPr>
-                      </pic:pic>
-                    </a:graphicData>
-                  </a:graphic>
-                </wp:inline>
-              </w:drawing>
-            </w:r>
-            <w:bookmarkEnd w:id="59"/>
-          </w:p>
-          <w:p>
-            <w:pPr>
-              <w:jc w:val="center"/>
-            </w:pPr>
-            <w:pPr>
-              <w:jc w:val="start"/>
-              <w:spacing w:before="200"/>
-              <w:pStyle w:val="ImageCaption"/>
-            </w:pPr>
-            <w:r>
-              <w:t xml:space="preserve"> </w:t>
-            </w:r>
-          </w:p>
-          <w:bookmarkEnd w:id="60"/>
-        </w:tc>
-      </w:tr>
-    </w:tbl>
-    <w:bookmarkEnd w:id="61"/>
-    <w:bookmarkStart w:id="62" w:name="remove-half-roof"/>
-    <w:p>
-      <w:pPr>
-        <w:pStyle w:val="Heading2"/>
-      </w:pPr>
-      <w:r>
-        <w:t xml:space="preserve">Remove Half Roof</w:t>
-      </w:r>
-    </w:p>
-    <w:p>
-      <w:pPr>
-        <w:pStyle w:val="Compact"/>
-        <w:numPr>
-          <w:ilvl w:val="0"/>
-          <w:numId w:val="1009"/>
-        </w:numPr>
-      </w:pPr>
-      <w:r>
-        <w:t xml:space="preserve">Remove the half roof by going down the top with a crowbar</w:t>
-      </w:r>
-      <w:r>
-        <w:br/>
-      </w:r>
-      <w:r>
-        <w:t xml:space="preserve">— Gently lift as you make your way to the other end</w:t>
-      </w:r>
-      <w:r>
-        <w:br/>
-      </w:r>
-      <w:r>
-        <w:t xml:space="preserve">— Do not force the top white board, especially at the ends.</w:t>
-      </w:r>
-      <w:r>
-        <w:t xml:space="preserve"> </w:t>
-      </w:r>
-      <w:r>
-        <w:t xml:space="preserve">If gentle prying does not free the board, raise the end rafters from the bottom to free the assembly.</w:t>
-      </w:r>
-    </w:p>
-    <w:p>
-      <w:pPr>
-        <w:pStyle w:val="Compact"/>
-        <w:numPr>
-          <w:ilvl w:val="0"/>
-          <w:numId w:val="1009"/>
-        </w:numPr>
-      </w:pPr>
-      <w:r>
-        <w:t xml:space="preserve">On both ends, lift the high side upwards</w:t>
-      </w:r>
-      <w:r>
-        <w:br/>
-      </w:r>
-      <w:r>
-        <w:t xml:space="preserve">— towards being perpendicular with the floor</w:t>
-      </w:r>
-      <w:r>
-        <w:br/>
-      </w:r>
-      <w:r>
-        <w:t xml:space="preserve">— it will work its way off the jig</w:t>
-      </w:r>
-    </w:p>
-    <w:p>
-      <w:r>
-        <w:br w:type="page"/>
-      </w:r>
-    </w:p>
-    <w:bookmarkEnd w:id="62"/>
-    <w:bookmarkEnd w:id="63"/>
-    <w:bookmarkStart w:id="64" w:name="half-roof-checklist"/>
+    <w:bookmarkStart w:id="50" w:name="half-roof-checklist"/>
     <w:p>
       <w:pPr>
         <w:pStyle w:val="Heading1"/>
@@ -1535,7 +1297,7 @@
         <w:t xml:space="preserve">Remove half roof from jig</w:t>
       </w:r>
     </w:p>
-    <w:bookmarkEnd w:id="64"/>
+    <w:bookmarkEnd w:id="50"/>
     <w:sectPr>
       <w:headerReference r:id="rId9" w:type="even"/>
       <w:headerReference r:id="rId11" w:type="default"/>

</xml_diff>